<commit_message>
Derive lastRun from fetched events, not the wall clock
lastRun was stamped with time.time() after the upload, so every event that
occurred while a run was in flight (or that the Audit API surfaced late)
fell behind the watermark and was never fetched. A capped --limit run also
jumped lastRun to now, skipping everything the cap left behind.

lastRun is now the newest fetched event's time minus a one-hour re-fetch
overlap. It never moves backwards and a capped run leaves it unchanged.
Re-fetched events are collapsed by the DuckDB upsert and skipped by the
AUDIT_ID upload delta. The model's LAST_RUN display and BATCH_ID code still
use the run time.

Co-Authored-By: Claude Opus 5.5 <noreply@anthropic.com>
</commit_message>
<xml_diff>
--- a/docs/operations-runbook.docx
+++ b/docs/operations-runbook.docx
@@ -3275,7 +3275,7 @@
         <w:t xml:space="preserve"> </w:t>
       </w:r>
       <w:r>
-        <w:t xml:space="preserve">is incremental — only events new since</w:t>
+        <w:t xml:space="preserve">is incremental — only events since</w:t>
       </w:r>
       <w:r>
         <w:t xml:space="preserve"> </w:t>
@@ -3287,7 +3287,25 @@
         <w:t xml:space="preserve">lastRun</w:t>
       </w:r>
       <w:r>
-        <w:t xml:space="preserve">. Back-to-back runs fetch ~0.</w:t>
+        <w:t xml:space="preserve">,</w:t>
+      </w:r>
+      <w:r>
+        <w:t xml:space="preserve"> </w:t>
+      </w:r>
+      <w:r>
+        <w:t xml:space="preserve">which trails the newest fetched event by a one-hour overlap. Back-to-back</w:t>
+      </w:r>
+      <w:r>
+        <w:t xml:space="preserve"> </w:t>
+      </w:r>
+      <w:r>
+        <w:t xml:space="preserve">runs re-fetch just that last hour; the duplicates are dropped before</w:t>
+      </w:r>
+      <w:r>
+        <w:t xml:space="preserve"> </w:t>
+      </w:r>
+      <w:r>
+        <w:t xml:space="preserve">upload.</w:t>
       </w:r>
     </w:p>
     <w:p>

</xml_diff>

<commit_message>
Derive lastRun from fetched events, not the wall clock (#10)
lastRun was stamped with time.time() after the upload, so every event that
occurred while a run was in flight (or that the Audit API surfaced late)
fell behind the watermark and was never fetched. A capped --limit run also
jumped lastRun to now, skipping everything the cap left behind.

lastRun is now the newest fetched event's time minus a one-hour re-fetch
overlap. It never moves backwards and a capped run leaves it unchanged.
Re-fetched events are collapsed by the DuckDB upsert and skipped by the
AUDIT_ID upload delta. The model's LAST_RUN display and BATCH_ID code still
use the run time.

Co-authored-by: Jon Ferneau <jon.ferneau@gmail.com>
Co-authored-by: Claude Opus 5.5 <noreply@anthropic.com>
</commit_message>
<xml_diff>
--- a/docs/operations-runbook.docx
+++ b/docs/operations-runbook.docx
@@ -3275,7 +3275,7 @@
         <w:t xml:space="preserve"> </w:t>
       </w:r>
       <w:r>
-        <w:t xml:space="preserve">is incremental — only events new since</w:t>
+        <w:t xml:space="preserve">is incremental — only events since</w:t>
       </w:r>
       <w:r>
         <w:t xml:space="preserve"> </w:t>
@@ -3287,7 +3287,25 @@
         <w:t xml:space="preserve">lastRun</w:t>
       </w:r>
       <w:r>
-        <w:t xml:space="preserve">. Back-to-back runs fetch ~0.</w:t>
+        <w:t xml:space="preserve">,</w:t>
+      </w:r>
+      <w:r>
+        <w:t xml:space="preserve"> </w:t>
+      </w:r>
+      <w:r>
+        <w:t xml:space="preserve">which trails the newest fetched event by a one-hour overlap. Back-to-back</w:t>
+      </w:r>
+      <w:r>
+        <w:t xml:space="preserve"> </w:t>
+      </w:r>
+      <w:r>
+        <w:t xml:space="preserve">runs re-fetch just that last hour; the duplicates are dropped before</w:t>
+      </w:r>
+      <w:r>
+        <w:t xml:space="preserve"> </w:t>
+      </w:r>
+      <w:r>
+        <w:t xml:space="preserve">upload.</w:t>
       </w:r>
     </w:p>
     <w:p>

</xml_diff>

<commit_message>
Guard combo config: skip by name, tolerate unreadable workspaces, warn on likely misconfig
- skip mode: entries match by ID or display name (case-insensitive), as
  select already did and the README already promised. An entry matching
  no model logs skip_combo_not_found.
- skip mode: a workspace whose models can't be listed is logged
  (workspace_models_unavailable) and left out instead of aborting the run,
  matching the metadata step.
- config_warnings(): "select" with no combos, and a blank anaplanTenantName
  while the audit pipeline is on. Logged at run start and printed by
  validate-config. Warnings only; no behaviour change.

Co-Authored-By: Claude Opus 5.5 <noreply@anthropic.com>
</commit_message>
<xml_diff>
--- a/docs/operations-runbook.docx
+++ b/docs/operations-runbook.docx
@@ -3204,6 +3204,126 @@
             </w:pPr>
             <w:r>
               <w:t xml:space="preserve">A single model export/upload issue — other models continue; audit run unaffected</w:t>
+            </w:r>
+          </w:p>
+        </w:tc>
+      </w:tr>
+      <w:tr>
+        <w:tc>
+          <w:tcPr/>
+          <w:p>
+            <w:pPr>
+              <w:pStyle w:val="Compact"/>
+            </w:pPr>
+            <w:r>
+              <w:rPr>
+                <w:rStyle w:val="VerbatimChar"/>
+              </w:rPr>
+              <w:t xml:space="preserve">config_warning</w:t>
+            </w:r>
+          </w:p>
+        </w:tc>
+        <w:tc>
+          <w:tcPr/>
+          <w:p>
+            <w:pPr>
+              <w:pStyle w:val="Compact"/>
+            </w:pPr>
+            <w:r>
+              <w:t xml:space="preserve">A valid but probably unintended setting (empty</w:t>
+            </w:r>
+            <w:r>
+              <w:t xml:space="preserve"> </w:t>
+            </w:r>
+            <w:r>
+              <w:rPr>
+                <w:rStyle w:val="VerbatimChar"/>
+              </w:rPr>
+              <w:t xml:space="preserve">select</w:t>
+            </w:r>
+            <w:r>
+              <w:t xml:space="preserve"> </w:t>
+            </w:r>
+            <w:r>
+              <w:t xml:space="preserve">list, blank</w:t>
+            </w:r>
+            <w:r>
+              <w:t xml:space="preserve"> </w:t>
+            </w:r>
+            <w:r>
+              <w:rPr>
+                <w:rStyle w:val="VerbatimChar"/>
+              </w:rPr>
+              <w:t xml:space="preserve">anaplanTenantName</w:t>
+            </w:r>
+            <w:r>
+              <w:t xml:space="preserve">). Also printed by</w:t>
+            </w:r>
+            <w:r>
+              <w:t xml:space="preserve"> </w:t>
+            </w:r>
+            <w:r>
+              <w:rPr>
+                <w:rStyle w:val="VerbatimChar"/>
+              </w:rPr>
+              <w:t xml:space="preserve">validate-config</w:t>
+            </w:r>
+          </w:p>
+        </w:tc>
+      </w:tr>
+      <w:tr>
+        <w:tc>
+          <w:tcPr/>
+          <w:p>
+            <w:pPr>
+              <w:pStyle w:val="Compact"/>
+            </w:pPr>
+            <w:r>
+              <w:rPr>
+                <w:rStyle w:val="VerbatimChar"/>
+              </w:rPr>
+              <w:t xml:space="preserve">workspace_models_unavailable</w:t>
+            </w:r>
+            <w:r>
+              <w:t xml:space="preserve"> </w:t>
+            </w:r>
+            <w:r>
+              <w:t xml:space="preserve">/</w:t>
+            </w:r>
+            <w:r>
+              <w:t xml:space="preserve"> </w:t>
+            </w:r>
+            <w:r>
+              <w:rPr>
+                <w:rStyle w:val="VerbatimChar"/>
+              </w:rPr>
+              <w:t xml:space="preserve">skip_combo_not_found</w:t>
+            </w:r>
+            <w:r>
+              <w:t xml:space="preserve"> </w:t>
+            </w:r>
+            <w:r>
+              <w:t xml:space="preserve">(warning)</w:t>
+            </w:r>
+          </w:p>
+        </w:tc>
+        <w:tc>
+          <w:tcPr/>
+          <w:p>
+            <w:pPr>
+              <w:pStyle w:val="Compact"/>
+            </w:pPr>
+            <w:r>
+              <w:rPr>
+                <w:rStyle w:val="VerbatimChar"/>
+              </w:rPr>
+              <w:t xml:space="preserve">skip</w:t>
+            </w:r>
+            <w:r>
+              <w:t xml:space="preserve"> </w:t>
+            </w:r>
+            <w:r>
+              <w:t xml:space="preserve">mode: a workspace's models couldn't be listed, or a skip entry matched no model</w:t>
             </w:r>
           </w:p>
         </w:tc>

</xml_diff>

<commit_message>
Guard combo config: skip by name, tolerate unreadable workspaces, warn on likely misconfig (#11)
- skip mode: entries match by ID or display name (case-insensitive), as
  select already did and the README already promised. An entry matching
  no model logs skip_combo_not_found.
- skip mode: a workspace whose models can't be listed is logged
  (workspace_models_unavailable) and left out instead of aborting the run,
  matching the metadata step.
- config_warnings(): "select" with no combos, and a blank anaplanTenantName
  while the audit pipeline is on. Logged at run start and printed by
  validate-config. Warnings only; no behaviour change.

Co-authored-by: Jon Ferneau <jon.ferneau@gmail.com>
Co-authored-by: Claude Opus 5.5 <noreply@anthropic.com>
</commit_message>
<xml_diff>
--- a/docs/operations-runbook.docx
+++ b/docs/operations-runbook.docx
@@ -3204,6 +3204,126 @@
             </w:pPr>
             <w:r>
               <w:t xml:space="preserve">A single model export/upload issue — other models continue; audit run unaffected</w:t>
+            </w:r>
+          </w:p>
+        </w:tc>
+      </w:tr>
+      <w:tr>
+        <w:tc>
+          <w:tcPr/>
+          <w:p>
+            <w:pPr>
+              <w:pStyle w:val="Compact"/>
+            </w:pPr>
+            <w:r>
+              <w:rPr>
+                <w:rStyle w:val="VerbatimChar"/>
+              </w:rPr>
+              <w:t xml:space="preserve">config_warning</w:t>
+            </w:r>
+          </w:p>
+        </w:tc>
+        <w:tc>
+          <w:tcPr/>
+          <w:p>
+            <w:pPr>
+              <w:pStyle w:val="Compact"/>
+            </w:pPr>
+            <w:r>
+              <w:t xml:space="preserve">A valid but probably unintended setting (empty</w:t>
+            </w:r>
+            <w:r>
+              <w:t xml:space="preserve"> </w:t>
+            </w:r>
+            <w:r>
+              <w:rPr>
+                <w:rStyle w:val="VerbatimChar"/>
+              </w:rPr>
+              <w:t xml:space="preserve">select</w:t>
+            </w:r>
+            <w:r>
+              <w:t xml:space="preserve"> </w:t>
+            </w:r>
+            <w:r>
+              <w:t xml:space="preserve">list, blank</w:t>
+            </w:r>
+            <w:r>
+              <w:t xml:space="preserve"> </w:t>
+            </w:r>
+            <w:r>
+              <w:rPr>
+                <w:rStyle w:val="VerbatimChar"/>
+              </w:rPr>
+              <w:t xml:space="preserve">anaplanTenantName</w:t>
+            </w:r>
+            <w:r>
+              <w:t xml:space="preserve">). Also printed by</w:t>
+            </w:r>
+            <w:r>
+              <w:t xml:space="preserve"> </w:t>
+            </w:r>
+            <w:r>
+              <w:rPr>
+                <w:rStyle w:val="VerbatimChar"/>
+              </w:rPr>
+              <w:t xml:space="preserve">validate-config</w:t>
+            </w:r>
+          </w:p>
+        </w:tc>
+      </w:tr>
+      <w:tr>
+        <w:tc>
+          <w:tcPr/>
+          <w:p>
+            <w:pPr>
+              <w:pStyle w:val="Compact"/>
+            </w:pPr>
+            <w:r>
+              <w:rPr>
+                <w:rStyle w:val="VerbatimChar"/>
+              </w:rPr>
+              <w:t xml:space="preserve">workspace_models_unavailable</w:t>
+            </w:r>
+            <w:r>
+              <w:t xml:space="preserve"> </w:t>
+            </w:r>
+            <w:r>
+              <w:t xml:space="preserve">/</w:t>
+            </w:r>
+            <w:r>
+              <w:t xml:space="preserve"> </w:t>
+            </w:r>
+            <w:r>
+              <w:rPr>
+                <w:rStyle w:val="VerbatimChar"/>
+              </w:rPr>
+              <w:t xml:space="preserve">skip_combo_not_found</w:t>
+            </w:r>
+            <w:r>
+              <w:t xml:space="preserve"> </w:t>
+            </w:r>
+            <w:r>
+              <w:t xml:space="preserve">(warning)</w:t>
+            </w:r>
+          </w:p>
+        </w:tc>
+        <w:tc>
+          <w:tcPr/>
+          <w:p>
+            <w:pPr>
+              <w:pStyle w:val="Compact"/>
+            </w:pPr>
+            <w:r>
+              <w:rPr>
+                <w:rStyle w:val="VerbatimChar"/>
+              </w:rPr>
+              <w:t xml:space="preserve">skip</w:t>
+            </w:r>
+            <w:r>
+              <w:t xml:space="preserve"> </w:t>
+            </w:r>
+            <w:r>
+              <w:t xml:space="preserve">mode: a workspace's models couldn't be listed, or a skip entry matched no model</w:t>
             </w:r>
           </w:p>
         </w:tc>

</xml_diff>